<commit_message>
Update room height label and commercial license notice.
Rename App. height to Est. height on iOS and Android, state commercial use in the licenses notice, and align license audit docs and validation checklist.

Co-authored-by: Cursor <cursoragent@cursor.com>
</commit_message>
<xml_diff>
--- a/docs/iOS_License_Validation_Checklist.docx
+++ b/docs/iOS_License_Validation_Checklist.docx
@@ -13,7 +13,7 @@
     </w:p>
     <w:p>
       <w:r>
-        <w:t>Date: 2026-07-12</w:t>
+        <w:t>Date: 2026-07-13</w:t>
       </w:r>
     </w:p>
     <w:p>
@@ -62,12 +62,12 @@
     </w:p>
     <w:p>
       <w:r>
-        <w:t>“Current release: This app is currently offered for non-commercial use only. A future commercial release may be subject to different terms.”</w:t>
+        <w:t>“Current release: This app is currently offered for commercial use.”</w:t>
       </w:r>
     </w:p>
     <w:p>
       <w:r>
-        <w:t>This is the app’s own policy text — not a standard open-source license. Flag if the company plans a normal paid App Store launch.</w:t>
+        <w:t>This is the app’s own policy text — not a standard open-source license. Confirm it matches how the app is sold (e.g. paid App Store launch).</w:t>
       </w:r>
     </w:p>
     <w:p>
@@ -1339,7 +1339,7 @@
           </w:tcPr>
           <w:p>
             <w:r>
-              <w:t>Top notice (“non-commercial use only”) is acceptable for how the app will be sold.</w:t>
+              <w:t>Top notice (“commercial use”) matches how the app will be sold.</w:t>
             </w:r>
           </w:p>
         </w:tc>

</xml_diff>